<commit_message>
Implement New Features and Enhanced the UI
</commit_message>
<xml_diff>
--- a/SRS_Document.docx
+++ b/SRS_Document.docx
@@ -2081,6 +2081,578 @@
         <w:spacing w:after="120"/>
       </w:pPr>
     </w:p>
+    <w:p>
+      <w:pPr>
+        <w:spacing w:after="120"/>
+      </w:pPr>
+    </w:p>
+    <w:p>
+      <w:pPr>
+        <w:numPr>
+          <w:ilvl w:val="0"/>
+          <w:numId w:val="10"/>
+        </w:numPr>
+        <w:spacing w:after="120"/>
+        <w:rPr>
+          <w:lang w:val="en-IN"/>
+        </w:rPr>
+      </w:pPr>
+      <w:r>
+        <w:rPr>
+          <w:b/>
+          <w:bCs/>
+          <w:lang w:val="en-IN"/>
+        </w:rPr>
+        <w:t>Planner Agent:</w:t>
+      </w:r>
+      <w:r>
+        <w:rPr>
+          <w:lang w:val="en-IN"/>
+        </w:rPr>
+        <w:t> Decomposes complex research topics into 3–5 targeted search sub-queries.</w:t>
+      </w:r>
+    </w:p>
+    <w:p>
+      <w:pPr>
+        <w:numPr>
+          <w:ilvl w:val="0"/>
+          <w:numId w:val="10"/>
+        </w:numPr>
+        <w:spacing w:after="120"/>
+        <w:rPr>
+          <w:lang w:val="en-IN"/>
+        </w:rPr>
+      </w:pPr>
+      <w:r>
+        <w:rPr>
+          <w:b/>
+          <w:bCs/>
+          <w:lang w:val="en-IN"/>
+        </w:rPr>
+        <w:t>Searcher Agent:</w:t>
+      </w:r>
+      <w:r>
+        <w:rPr>
+          <w:lang w:val="en-IN"/>
+        </w:rPr>
+        <w:t xml:space="preserve"> Queries </w:t>
+      </w:r>
+      <w:proofErr w:type="spellStart"/>
+      <w:r>
+        <w:rPr>
+          <w:lang w:val="en-IN"/>
+        </w:rPr>
+        <w:t>Tavily</w:t>
+      </w:r>
+      <w:proofErr w:type="spellEnd"/>
+      <w:r>
+        <w:rPr>
+          <w:lang w:val="en-IN"/>
+        </w:rPr>
+        <w:t xml:space="preserve"> / Brave APIs to discover live web sources.</w:t>
+      </w:r>
+    </w:p>
+    <w:p>
+      <w:pPr>
+        <w:numPr>
+          <w:ilvl w:val="0"/>
+          <w:numId w:val="10"/>
+        </w:numPr>
+        <w:spacing w:after="120"/>
+        <w:rPr>
+          <w:lang w:val="en-IN"/>
+        </w:rPr>
+      </w:pPr>
+      <w:r>
+        <w:rPr>
+          <w:b/>
+          <w:bCs/>
+          <w:lang w:val="en-IN"/>
+        </w:rPr>
+        <w:t>Crawler Agent:</w:t>
+      </w:r>
+      <w:r>
+        <w:rPr>
+          <w:lang w:val="en-IN"/>
+        </w:rPr>
+        <w:t> Scrapes raw HTML and strips boilerplate elements (ads, navigation bars).</w:t>
+      </w:r>
+    </w:p>
+    <w:p>
+      <w:pPr>
+        <w:numPr>
+          <w:ilvl w:val="0"/>
+          <w:numId w:val="10"/>
+        </w:numPr>
+        <w:spacing w:after="120"/>
+        <w:rPr>
+          <w:lang w:val="en-IN"/>
+        </w:rPr>
+      </w:pPr>
+      <w:proofErr w:type="spellStart"/>
+      <w:r>
+        <w:rPr>
+          <w:b/>
+          <w:bCs/>
+          <w:lang w:val="en-IN"/>
+        </w:rPr>
+        <w:t>Chunker</w:t>
+      </w:r>
+      <w:proofErr w:type="spellEnd"/>
+      <w:r>
+        <w:rPr>
+          <w:b/>
+          <w:bCs/>
+          <w:lang w:val="en-IN"/>
+        </w:rPr>
+        <w:t xml:space="preserve"> Agent:</w:t>
+      </w:r>
+      <w:r>
+        <w:rPr>
+          <w:lang w:val="en-IN"/>
+        </w:rPr>
+        <w:t> Splits text into optimal 800-character semantic chunks with overlap.</w:t>
+      </w:r>
+    </w:p>
+    <w:p>
+      <w:pPr>
+        <w:numPr>
+          <w:ilvl w:val="0"/>
+          <w:numId w:val="10"/>
+        </w:numPr>
+        <w:spacing w:after="120"/>
+        <w:rPr>
+          <w:lang w:val="en-IN"/>
+        </w:rPr>
+      </w:pPr>
+      <w:r>
+        <w:rPr>
+          <w:b/>
+          <w:bCs/>
+          <w:lang w:val="en-IN"/>
+        </w:rPr>
+        <w:t>Vector RAG Agent:</w:t>
+      </w:r>
+      <w:r>
+        <w:rPr>
+          <w:lang w:val="en-IN"/>
+        </w:rPr>
+        <w:t> Generates embeddings &amp; indexes/retrieves context from </w:t>
+      </w:r>
+      <w:r>
+        <w:rPr>
+          <w:b/>
+          <w:bCs/>
+          <w:lang w:val="en-IN"/>
+        </w:rPr>
+        <w:t>PostgreSQL </w:t>
+      </w:r>
+      <w:proofErr w:type="spellStart"/>
+      <w:r>
+        <w:rPr>
+          <w:b/>
+          <w:bCs/>
+          <w:lang w:val="en-IN"/>
+        </w:rPr>
+        <w:t>pgvector</w:t>
+      </w:r>
+      <w:proofErr w:type="spellEnd"/>
+      <w:r>
+        <w:rPr>
+          <w:lang w:val="en-IN"/>
+        </w:rPr>
+        <w:t>.</w:t>
+      </w:r>
+    </w:p>
+    <w:p>
+      <w:pPr>
+        <w:numPr>
+          <w:ilvl w:val="0"/>
+          <w:numId w:val="10"/>
+        </w:numPr>
+        <w:spacing w:after="120"/>
+        <w:rPr>
+          <w:lang w:val="en-IN"/>
+        </w:rPr>
+      </w:pPr>
+      <w:r>
+        <w:rPr>
+          <w:b/>
+          <w:bCs/>
+          <w:lang w:val="en-IN"/>
+        </w:rPr>
+        <w:t>Reasoner Agent:</w:t>
+      </w:r>
+      <w:r>
+        <w:rPr>
+          <w:lang w:val="en-IN"/>
+        </w:rPr>
+        <w:t> Synthesizes structured insights, key findings, and data arguments.</w:t>
+      </w:r>
+    </w:p>
+    <w:p>
+      <w:pPr>
+        <w:numPr>
+          <w:ilvl w:val="0"/>
+          <w:numId w:val="10"/>
+        </w:numPr>
+        <w:spacing w:after="120"/>
+        <w:rPr>
+          <w:lang w:val="en-IN"/>
+        </w:rPr>
+      </w:pPr>
+      <w:r>
+        <w:rPr>
+          <w:b/>
+          <w:bCs/>
+          <w:lang w:val="en-IN"/>
+        </w:rPr>
+        <w:t>Writer Agent:</w:t>
+      </w:r>
+      <w:r>
+        <w:rPr>
+          <w:lang w:val="en-IN"/>
+        </w:rPr>
+        <w:t> Drafts academic paper sections (</w:t>
+      </w:r>
+      <w:r>
+        <w:rPr>
+          <w:i/>
+          <w:iCs/>
+          <w:lang w:val="en-IN"/>
+        </w:rPr>
+        <w:t>Abstract, Introduction, System Design, Analysis, Conclusion</w:t>
+      </w:r>
+      <w:r>
+        <w:rPr>
+          <w:lang w:val="en-IN"/>
+        </w:rPr>
+        <w:t>).</w:t>
+      </w:r>
+    </w:p>
+    <w:p>
+      <w:pPr>
+        <w:numPr>
+          <w:ilvl w:val="0"/>
+          <w:numId w:val="10"/>
+        </w:numPr>
+        <w:spacing w:after="120"/>
+        <w:rPr>
+          <w:lang w:val="en-IN"/>
+        </w:rPr>
+      </w:pPr>
+      <w:r>
+        <w:rPr>
+          <w:b/>
+          <w:bCs/>
+          <w:lang w:val="en-IN"/>
+        </w:rPr>
+        <w:t>Citation Agent:</w:t>
+      </w:r>
+      <w:r>
+        <w:rPr>
+          <w:lang w:val="en-IN"/>
+        </w:rPr>
+        <w:t> Validates inline claims and maps citations directly to source URLs.</w:t>
+      </w:r>
+    </w:p>
+    <w:p>
+      <w:pPr>
+        <w:numPr>
+          <w:ilvl w:val="0"/>
+          <w:numId w:val="10"/>
+        </w:numPr>
+        <w:spacing w:after="120"/>
+        <w:rPr>
+          <w:lang w:val="en-IN"/>
+        </w:rPr>
+      </w:pPr>
+      <w:r>
+        <w:rPr>
+          <w:b/>
+          <w:bCs/>
+          <w:lang w:val="en-IN"/>
+        </w:rPr>
+        <w:t>Reviewer Agent:</w:t>
+      </w:r>
+      <w:r>
+        <w:rPr>
+          <w:lang w:val="en-IN"/>
+        </w:rPr>
+        <w:t> Automated peer-review &amp; self-correction loop (evaluating clarity and completeness).</w:t>
+      </w:r>
+    </w:p>
+    <w:p>
+      <w:pPr>
+        <w:numPr>
+          <w:ilvl w:val="0"/>
+          <w:numId w:val="10"/>
+        </w:numPr>
+        <w:spacing w:after="120"/>
+        <w:rPr>
+          <w:lang w:val="en-IN"/>
+        </w:rPr>
+      </w:pPr>
+      <w:r>
+        <w:rPr>
+          <w:b/>
+          <w:bCs/>
+          <w:lang w:val="en-IN"/>
+        </w:rPr>
+        <w:t>Diagram Agent:</w:t>
+      </w:r>
+      <w:r>
+        <w:rPr>
+          <w:lang w:val="en-IN"/>
+        </w:rPr>
+        <w:t> Extracts system components and generates interactive </w:t>
+      </w:r>
+      <w:r>
+        <w:rPr>
+          <w:b/>
+          <w:bCs/>
+          <w:lang w:val="en-IN"/>
+        </w:rPr>
+        <w:t>Mermaid.js diagrams</w:t>
+      </w:r>
+      <w:r>
+        <w:rPr>
+          <w:lang w:val="en-IN"/>
+        </w:rPr>
+        <w:t>.</w:t>
+      </w:r>
+    </w:p>
+    <w:p>
+      <w:pPr>
+        <w:spacing w:after="120"/>
+      </w:pPr>
+    </w:p>
+    <w:p>
+      <w:pPr>
+        <w:numPr>
+          <w:ilvl w:val="0"/>
+          <w:numId w:val="11"/>
+        </w:numPr>
+        <w:spacing w:after="120"/>
+        <w:rPr>
+          <w:lang w:val="en-IN"/>
+        </w:rPr>
+      </w:pPr>
+      <w:r>
+        <w:rPr>
+          <w:b/>
+          <w:bCs/>
+          <w:lang w:val="en-IN"/>
+        </w:rPr>
+        <w:t>Interactive Chat-with-Paper Assistant:</w:t>
+      </w:r>
+      <w:r>
+        <w:rPr>
+          <w:lang w:val="en-IN"/>
+        </w:rPr>
+        <w:t> Ask questions directly to the generated paper using indexed </w:t>
+      </w:r>
+      <w:proofErr w:type="spellStart"/>
+      <w:r>
+        <w:rPr>
+          <w:lang w:val="en-IN"/>
+        </w:rPr>
+        <w:t>pgvector</w:t>
+      </w:r>
+      <w:proofErr w:type="spellEnd"/>
+      <w:r>
+        <w:rPr>
+          <w:lang w:val="en-IN"/>
+        </w:rPr>
+        <w:t> context.</w:t>
+      </w:r>
+    </w:p>
+    <w:p>
+      <w:pPr>
+        <w:numPr>
+          <w:ilvl w:val="0"/>
+          <w:numId w:val="11"/>
+        </w:numPr>
+        <w:spacing w:after="120"/>
+        <w:rPr>
+          <w:lang w:val="en-IN"/>
+        </w:rPr>
+      </w:pPr>
+      <w:r>
+        <w:rPr>
+          <w:b/>
+          <w:bCs/>
+          <w:lang w:val="en-IN"/>
+        </w:rPr>
+        <w:lastRenderedPageBreak/>
+        <w:t>Multi-Format Exporters:</w:t>
+      </w:r>
+      <w:r>
+        <w:rPr>
+          <w:lang w:val="en-IN"/>
+        </w:rPr>
+        <w:t> One-click downloads for </w:t>
+      </w:r>
+      <w:r>
+        <w:rPr>
+          <w:b/>
+          <w:bCs/>
+          <w:lang w:val="en-IN"/>
+        </w:rPr>
+        <w:t>IEEE PDF</w:t>
+      </w:r>
+      <w:r>
+        <w:rPr>
+          <w:lang w:val="en-IN"/>
+        </w:rPr>
+        <w:t>, </w:t>
+      </w:r>
+      <w:r>
+        <w:rPr>
+          <w:b/>
+          <w:bCs/>
+          <w:lang w:val="en-IN"/>
+        </w:rPr>
+        <w:t>LaTeX (.</w:t>
+      </w:r>
+      <w:proofErr w:type="spellStart"/>
+      <w:r>
+        <w:rPr>
+          <w:b/>
+          <w:bCs/>
+          <w:lang w:val="en-IN"/>
+        </w:rPr>
+        <w:t>tex</w:t>
+      </w:r>
+      <w:proofErr w:type="spellEnd"/>
+      <w:r>
+        <w:rPr>
+          <w:b/>
+          <w:bCs/>
+          <w:lang w:val="en-IN"/>
+        </w:rPr>
+        <w:t>)</w:t>
+      </w:r>
+      <w:r>
+        <w:rPr>
+          <w:lang w:val="en-IN"/>
+        </w:rPr>
+        <w:t>, and </w:t>
+      </w:r>
+      <w:r>
+        <w:rPr>
+          <w:b/>
+          <w:bCs/>
+          <w:lang w:val="en-IN"/>
+        </w:rPr>
+        <w:t>Marp Presentation Slides (.pptx)</w:t>
+      </w:r>
+      <w:r>
+        <w:rPr>
+          <w:lang w:val="en-IN"/>
+        </w:rPr>
+        <w:t>.</w:t>
+      </w:r>
+    </w:p>
+    <w:p>
+      <w:pPr>
+        <w:numPr>
+          <w:ilvl w:val="0"/>
+          <w:numId w:val="11"/>
+        </w:numPr>
+        <w:spacing w:after="120"/>
+        <w:rPr>
+          <w:lang w:val="en-IN"/>
+        </w:rPr>
+      </w:pPr>
+      <w:r>
+        <w:rPr>
+          <w:b/>
+          <w:bCs/>
+          <w:lang w:val="en-IN"/>
+        </w:rPr>
+        <w:t>Collaborative Research Workspaces:</w:t>
+      </w:r>
+      <w:r>
+        <w:rPr>
+          <w:lang w:val="en-IN"/>
+        </w:rPr>
+        <w:t> Shared rooms allowing team members to view paper generation history.</w:t>
+      </w:r>
+    </w:p>
+    <w:p>
+      <w:pPr>
+        <w:numPr>
+          <w:ilvl w:val="0"/>
+          <w:numId w:val="11"/>
+        </w:numPr>
+        <w:spacing w:after="120"/>
+        <w:rPr>
+          <w:lang w:val="en-IN"/>
+        </w:rPr>
+      </w:pPr>
+      <w:r>
+        <w:rPr>
+          <w:b/>
+          <w:bCs/>
+          <w:lang w:val="en-IN"/>
+        </w:rPr>
+        <w:t>Research Depth Controller:</w:t>
+      </w:r>
+      <w:r>
+        <w:rPr>
+          <w:lang w:val="en-IN"/>
+        </w:rPr>
+        <w:t> Select execution modes (</w:t>
+      </w:r>
+      <w:r>
+        <w:rPr>
+          <w:i/>
+          <w:iCs/>
+          <w:lang w:val="en-IN"/>
+        </w:rPr>
+        <w:t>Fast Draft</w:t>
+      </w:r>
+      <w:r>
+        <w:rPr>
+          <w:lang w:val="en-IN"/>
+        </w:rPr>
+        <w:t>, </w:t>
+      </w:r>
+      <w:r>
+        <w:rPr>
+          <w:i/>
+          <w:iCs/>
+          <w:lang w:val="en-IN"/>
+        </w:rPr>
+        <w:t>Balanced Research</w:t>
+      </w:r>
+      <w:r>
+        <w:rPr>
+          <w:lang w:val="en-IN"/>
+        </w:rPr>
+        <w:t>, </w:t>
+      </w:r>
+      <w:r>
+        <w:rPr>
+          <w:i/>
+          <w:iCs/>
+          <w:lang w:val="en-IN"/>
+        </w:rPr>
+        <w:t>Deep Academic Audit</w:t>
+      </w:r>
+      <w:r>
+        <w:rPr>
+          <w:lang w:val="en-IN"/>
+        </w:rPr>
+        <w:t>).</w:t>
+      </w:r>
+    </w:p>
+    <w:p>
+      <w:pPr>
+        <w:spacing w:after="120"/>
+      </w:pPr>
+    </w:p>
     <w:sectPr>
       <w:pgSz w:w="12240" w:h="15840"/>
       <w:pgMar w:top="1440" w:right="1440" w:bottom="1440" w:left="1440" w:header="720" w:footer="720" w:gutter="0"/>
@@ -2262,6 +2834,268 @@
       <w:rPr>
         <w:rFonts w:ascii="Symbol" w:hAnsi="Symbol" w:hint="default"/>
       </w:rPr>
+    </w:lvl>
+  </w:abstractNum>
+  <w:abstractNum w:abstractNumId="9" w15:restartNumberingAfterBreak="0">
+    <w:nsid w:val="2E390F84"/>
+    <w:multiLevelType w:val="multilevel"/>
+    <w:tmpl w:val="B96860A8"/>
+    <w:lvl w:ilvl="0">
+      <w:start w:val="1"/>
+      <w:numFmt w:val="bullet"/>
+      <w:lvlText w:val=""/>
+      <w:lvlJc w:val="left"/>
+      <w:pPr>
+        <w:tabs>
+          <w:tab w:val="num" w:pos="720"/>
+        </w:tabs>
+        <w:ind w:left="720" w:hanging="360"/>
+      </w:pPr>
+      <w:rPr>
+        <w:rFonts w:ascii="Symbol" w:hAnsi="Symbol" w:hint="default"/>
+        <w:sz w:val="20"/>
+      </w:rPr>
+    </w:lvl>
+    <w:lvl w:ilvl="1" w:tentative="1">
+      <w:start w:val="1"/>
+      <w:numFmt w:val="bullet"/>
+      <w:lvlText w:val=""/>
+      <w:lvlJc w:val="left"/>
+      <w:pPr>
+        <w:tabs>
+          <w:tab w:val="num" w:pos="1440"/>
+        </w:tabs>
+        <w:ind w:left="1440" w:hanging="360"/>
+      </w:pPr>
+      <w:rPr>
+        <w:rFonts w:ascii="Symbol" w:hAnsi="Symbol" w:hint="default"/>
+        <w:sz w:val="20"/>
+      </w:rPr>
+    </w:lvl>
+    <w:lvl w:ilvl="2" w:tentative="1">
+      <w:start w:val="1"/>
+      <w:numFmt w:val="bullet"/>
+      <w:lvlText w:val=""/>
+      <w:lvlJc w:val="left"/>
+      <w:pPr>
+        <w:tabs>
+          <w:tab w:val="num" w:pos="2160"/>
+        </w:tabs>
+        <w:ind w:left="2160" w:hanging="360"/>
+      </w:pPr>
+      <w:rPr>
+        <w:rFonts w:ascii="Symbol" w:hAnsi="Symbol" w:hint="default"/>
+        <w:sz w:val="20"/>
+      </w:rPr>
+    </w:lvl>
+    <w:lvl w:ilvl="3" w:tentative="1">
+      <w:start w:val="1"/>
+      <w:numFmt w:val="bullet"/>
+      <w:lvlText w:val=""/>
+      <w:lvlJc w:val="left"/>
+      <w:pPr>
+        <w:tabs>
+          <w:tab w:val="num" w:pos="2880"/>
+        </w:tabs>
+        <w:ind w:left="2880" w:hanging="360"/>
+      </w:pPr>
+      <w:rPr>
+        <w:rFonts w:ascii="Symbol" w:hAnsi="Symbol" w:hint="default"/>
+        <w:sz w:val="20"/>
+      </w:rPr>
+    </w:lvl>
+    <w:lvl w:ilvl="4" w:tentative="1">
+      <w:start w:val="1"/>
+      <w:numFmt w:val="bullet"/>
+      <w:lvlText w:val=""/>
+      <w:lvlJc w:val="left"/>
+      <w:pPr>
+        <w:tabs>
+          <w:tab w:val="num" w:pos="3600"/>
+        </w:tabs>
+        <w:ind w:left="3600" w:hanging="360"/>
+      </w:pPr>
+      <w:rPr>
+        <w:rFonts w:ascii="Symbol" w:hAnsi="Symbol" w:hint="default"/>
+        <w:sz w:val="20"/>
+      </w:rPr>
+    </w:lvl>
+    <w:lvl w:ilvl="5" w:tentative="1">
+      <w:start w:val="1"/>
+      <w:numFmt w:val="bullet"/>
+      <w:lvlText w:val=""/>
+      <w:lvlJc w:val="left"/>
+      <w:pPr>
+        <w:tabs>
+          <w:tab w:val="num" w:pos="4320"/>
+        </w:tabs>
+        <w:ind w:left="4320" w:hanging="360"/>
+      </w:pPr>
+      <w:rPr>
+        <w:rFonts w:ascii="Symbol" w:hAnsi="Symbol" w:hint="default"/>
+        <w:sz w:val="20"/>
+      </w:rPr>
+    </w:lvl>
+    <w:lvl w:ilvl="6" w:tentative="1">
+      <w:start w:val="1"/>
+      <w:numFmt w:val="bullet"/>
+      <w:lvlText w:val=""/>
+      <w:lvlJc w:val="left"/>
+      <w:pPr>
+        <w:tabs>
+          <w:tab w:val="num" w:pos="5040"/>
+        </w:tabs>
+        <w:ind w:left="5040" w:hanging="360"/>
+      </w:pPr>
+      <w:rPr>
+        <w:rFonts w:ascii="Symbol" w:hAnsi="Symbol" w:hint="default"/>
+        <w:sz w:val="20"/>
+      </w:rPr>
+    </w:lvl>
+    <w:lvl w:ilvl="7" w:tentative="1">
+      <w:start w:val="1"/>
+      <w:numFmt w:val="bullet"/>
+      <w:lvlText w:val=""/>
+      <w:lvlJc w:val="left"/>
+      <w:pPr>
+        <w:tabs>
+          <w:tab w:val="num" w:pos="5760"/>
+        </w:tabs>
+        <w:ind w:left="5760" w:hanging="360"/>
+      </w:pPr>
+      <w:rPr>
+        <w:rFonts w:ascii="Symbol" w:hAnsi="Symbol" w:hint="default"/>
+        <w:sz w:val="20"/>
+      </w:rPr>
+    </w:lvl>
+    <w:lvl w:ilvl="8" w:tentative="1">
+      <w:start w:val="1"/>
+      <w:numFmt w:val="bullet"/>
+      <w:lvlText w:val=""/>
+      <w:lvlJc w:val="left"/>
+      <w:pPr>
+        <w:tabs>
+          <w:tab w:val="num" w:pos="6480"/>
+        </w:tabs>
+        <w:ind w:left="6480" w:hanging="360"/>
+      </w:pPr>
+      <w:rPr>
+        <w:rFonts w:ascii="Symbol" w:hAnsi="Symbol" w:hint="default"/>
+        <w:sz w:val="20"/>
+      </w:rPr>
+    </w:lvl>
+  </w:abstractNum>
+  <w:abstractNum w:abstractNumId="10" w15:restartNumberingAfterBreak="0">
+    <w:nsid w:val="474329CB"/>
+    <w:multiLevelType w:val="multilevel"/>
+    <w:tmpl w:val="0702413A"/>
+    <w:lvl w:ilvl="0">
+      <w:start w:val="1"/>
+      <w:numFmt w:val="decimal"/>
+      <w:lvlText w:val="%1."/>
+      <w:lvlJc w:val="left"/>
+      <w:pPr>
+        <w:tabs>
+          <w:tab w:val="num" w:pos="720"/>
+        </w:tabs>
+        <w:ind w:left="720" w:hanging="360"/>
+      </w:pPr>
+    </w:lvl>
+    <w:lvl w:ilvl="1" w:tentative="1">
+      <w:start w:val="1"/>
+      <w:numFmt w:val="decimal"/>
+      <w:lvlText w:val="%2."/>
+      <w:lvlJc w:val="left"/>
+      <w:pPr>
+        <w:tabs>
+          <w:tab w:val="num" w:pos="1440"/>
+        </w:tabs>
+        <w:ind w:left="1440" w:hanging="360"/>
+      </w:pPr>
+    </w:lvl>
+    <w:lvl w:ilvl="2" w:tentative="1">
+      <w:start w:val="1"/>
+      <w:numFmt w:val="decimal"/>
+      <w:lvlText w:val="%3."/>
+      <w:lvlJc w:val="left"/>
+      <w:pPr>
+        <w:tabs>
+          <w:tab w:val="num" w:pos="2160"/>
+        </w:tabs>
+        <w:ind w:left="2160" w:hanging="360"/>
+      </w:pPr>
+    </w:lvl>
+    <w:lvl w:ilvl="3" w:tentative="1">
+      <w:start w:val="1"/>
+      <w:numFmt w:val="decimal"/>
+      <w:lvlText w:val="%4."/>
+      <w:lvlJc w:val="left"/>
+      <w:pPr>
+        <w:tabs>
+          <w:tab w:val="num" w:pos="2880"/>
+        </w:tabs>
+        <w:ind w:left="2880" w:hanging="360"/>
+      </w:pPr>
+    </w:lvl>
+    <w:lvl w:ilvl="4" w:tentative="1">
+      <w:start w:val="1"/>
+      <w:numFmt w:val="decimal"/>
+      <w:lvlText w:val="%5."/>
+      <w:lvlJc w:val="left"/>
+      <w:pPr>
+        <w:tabs>
+          <w:tab w:val="num" w:pos="3600"/>
+        </w:tabs>
+        <w:ind w:left="3600" w:hanging="360"/>
+      </w:pPr>
+    </w:lvl>
+    <w:lvl w:ilvl="5" w:tentative="1">
+      <w:start w:val="1"/>
+      <w:numFmt w:val="decimal"/>
+      <w:lvlText w:val="%6."/>
+      <w:lvlJc w:val="left"/>
+      <w:pPr>
+        <w:tabs>
+          <w:tab w:val="num" w:pos="4320"/>
+        </w:tabs>
+        <w:ind w:left="4320" w:hanging="360"/>
+      </w:pPr>
+    </w:lvl>
+    <w:lvl w:ilvl="6" w:tentative="1">
+      <w:start w:val="1"/>
+      <w:numFmt w:val="decimal"/>
+      <w:lvlText w:val="%7."/>
+      <w:lvlJc w:val="left"/>
+      <w:pPr>
+        <w:tabs>
+          <w:tab w:val="num" w:pos="5040"/>
+        </w:tabs>
+        <w:ind w:left="5040" w:hanging="360"/>
+      </w:pPr>
+    </w:lvl>
+    <w:lvl w:ilvl="7" w:tentative="1">
+      <w:start w:val="1"/>
+      <w:numFmt w:val="decimal"/>
+      <w:lvlText w:val="%8."/>
+      <w:lvlJc w:val="left"/>
+      <w:pPr>
+        <w:tabs>
+          <w:tab w:val="num" w:pos="5760"/>
+        </w:tabs>
+        <w:ind w:left="5760" w:hanging="360"/>
+      </w:pPr>
+    </w:lvl>
+    <w:lvl w:ilvl="8" w:tentative="1">
+      <w:start w:val="1"/>
+      <w:numFmt w:val="decimal"/>
+      <w:lvlText w:val="%9."/>
+      <w:lvlJc w:val="left"/>
+      <w:pPr>
+        <w:tabs>
+          <w:tab w:val="num" w:pos="6480"/>
+        </w:tabs>
+        <w:ind w:left="6480" w:hanging="360"/>
+      </w:pPr>
     </w:lvl>
   </w:abstractNum>
   <w:num w:numId="1" w16cid:durableId="1479036241">
@@ -2290,6 +3124,12 @@
   </w:num>
   <w:num w:numId="9" w16cid:durableId="1081218019">
     <w:abstractNumId w:val="0"/>
+  </w:num>
+  <w:num w:numId="10" w16cid:durableId="1842969068">
+    <w:abstractNumId w:val="10"/>
+  </w:num>
+  <w:num w:numId="11" w16cid:durableId="1127089835">
+    <w:abstractNumId w:val="9"/>
   </w:num>
 </w:numbering>
 </file>
@@ -2901,7 +3741,6 @@
   <w:style w:type="character" w:default="1" w:styleId="DefaultParagraphFont">
     <w:name w:val="Default Paragraph Font"/>
     <w:uiPriority w:val="1"/>
-    <w:semiHidden/>
     <w:unhideWhenUsed/>
   </w:style>
   <w:style w:type="table" w:default="1" w:styleId="TableNormal">

</xml_diff>